<commit_message>
modificaciones proceso nuevo cliente
</commit_message>
<xml_diff>
--- a/assets/procesos/nuevos-clientes-instalacion/proceso-venta-atencion-por-areas.docx
+++ b/assets/procesos/nuevos-clientes-instalacion/proceso-venta-atencion-por-areas.docx
@@ -735,7 +735,7 @@
                 <w:sz w:val="19"/>
                 <w:szCs w:val="19"/>
               </w:rPr>
-              <w:t>Bienvenida y seguimiento postventa inicial</w:t>
+              <w:t>Bienvenida al cliente</w:t>
             </w:r>
           </w:p>
         </w:tc>
@@ -3782,7 +3782,376 @@
               <w:jc w:val="both"/>
             </w:pPr>
             <w:r>
-              <w:t>Etapa 8 — Coordinación de la instalación.</w:t>
+              <w:t>Etapa 8 — Bienvenida al cliente.</w:t>
+            </w:r>
+          </w:p>
+        </w:tc>
+      </w:tr>
+    </w:tbl>
+    <w:p>
+      <w:pPr>
+        <w:pStyle w:val="Ttulo2"/>
+        <w:pBdr>
+          <w:bottom w:val="single" w:sz="8" w:space="3" w:color="1F7A5C"/>
+        </w:pBdr>
+        <w:spacing w:before="320" w:after="40"/>
+      </w:pPr>
+      <w:r>
+        <w:rPr>
+          <w:b/>
+          <w:bCs/>
+          <w:color w:val="1F7A5C"/>
+          <w:sz w:val="25"/>
+          <w:szCs w:val="25"/>
+        </w:rPr>
+        <w:t xml:space="preserve">Etapa 8. </w:t>
+      </w:r>
+      <w:r>
+        <w:rPr>
+          <w:b/>
+          <w:bCs/>
+          <w:color w:val="1F3864"/>
+          <w:sz w:val="25"/>
+          <w:szCs w:val="25"/>
+        </w:rPr>
+        <w:t>Bienvenida al cliente</w:t>
+      </w:r>
+      <w:r>
+        <w:rPr>
+          <w:i/>
+          <w:iCs/>
+          <w:color w:val="595959"/>
+          <w:sz w:val="18"/>
+          <w:szCs w:val="18"/>
+        </w:rPr>
+      </w:r>
+    </w:p>
+    <w:p>
+      <w:pPr>
+        <w:spacing w:after="100"/>
+      </w:pPr>
+      <w:r>
+        <w:rPr>
+          <w:color w:val="595959"/>
+          <w:sz w:val="19"/>
+          <w:szCs w:val="19"/>
+        </w:rPr>
+        <w:t xml:space="preserve">Área responsable:  </w:t>
+      </w:r>
+      <w:r>
+        <w:rPr>
+          <w:b/>
+          <w:bCs/>
+          <w:color w:val="1F7A5C"/>
+          <w:sz w:val="19"/>
+          <w:szCs w:val="19"/>
+        </w:rPr>
+        <w:t>ATENCIÓN AL CLIENTE</w:t>
+      </w:r>
+    </w:p>
+    <w:tbl>
+      <w:tblPr>
+        <w:tblW w:w="9840" w:type="dxa"/>
+        <w:tblBorders>
+          <w:top w:val="single" w:sz="4" w:space="0" w:color="auto"/>
+          <w:left w:val="single" w:sz="4" w:space="0" w:color="auto"/>
+          <w:bottom w:val="single" w:sz="4" w:space="0" w:color="auto"/>
+          <w:right w:val="single" w:sz="4" w:space="0" w:color="auto"/>
+          <w:insideH w:val="single" w:sz="4" w:space="0" w:color="auto"/>
+          <w:insideV w:val="single" w:sz="4" w:space="0" w:color="auto"/>
+        </w:tblBorders>
+        <w:tblCellMar>
+          <w:left w:w="10" w:type="dxa"/>
+          <w:right w:w="10" w:type="dxa"/>
+        </w:tblCellMar>
+        <w:tblLook w:val="04A0" w:firstRow="1" w:lastRow="0" w:firstColumn="1" w:lastColumn="0" w:noHBand="0" w:noVBand="1"/>
+      </w:tblPr>
+      <w:tblGrid>
+        <w:gridCol w:w="2100"/>
+        <w:gridCol w:w="7740"/>
+      </w:tblGrid>
+      <w:tr>
+        <w:tc>
+          <w:tcPr>
+            <w:tcW w:w="2100" w:type="dxa"/>
+            <w:shd w:val="clear" w:color="auto" w:fill="DCEEE6"/>
+            <w:tcMar>
+              <w:top w:w="100" w:type="dxa"/>
+              <w:left w:w="120" w:type="dxa"/>
+              <w:bottom w:w="100" w:type="dxa"/>
+              <w:right w:w="120" w:type="dxa"/>
+            </w:tcMar>
+          </w:tcPr>
+          <w:p>
+            <w:r>
+              <w:rPr>
+                <w:b/>
+                <w:bCs/>
+                <w:color w:val="1F7A5C"/>
+                <w:sz w:val="20"/>
+                <w:szCs w:val="20"/>
+              </w:rPr>
+              <w:t>Objetivo</w:t>
+            </w:r>
+          </w:p>
+        </w:tc>
+        <w:tc>
+          <w:tcPr>
+            <w:tcW w:w="7740" w:type="dxa"/>
+            <w:tcMar>
+              <w:top w:w="100" w:type="dxa"/>
+              <w:left w:w="140" w:type="dxa"/>
+              <w:bottom w:w="100" w:type="dxa"/>
+              <w:right w:w="140" w:type="dxa"/>
+            </w:tcMar>
+          </w:tcPr>
+          <w:p>
+            <w:pPr>
+              <w:spacing w:line="280" w:lineRule="auto"/>
+              <w:jc w:val="both"/>
+            </w:pPr>
+            <w:r>
+              <w:t>Dar la bienvenida al cliente antes de la instalación, explicarle cómo sigue el proceso y con quién comunicarse en cada etapa.</w:t>
+            </w:r>
+          </w:p>
+        </w:tc>
+      </w:tr>
+      <w:tr>
+        <w:tc>
+          <w:tcPr>
+            <w:tcW w:w="2100" w:type="dxa"/>
+            <w:shd w:val="clear" w:color="auto" w:fill="DCEEE6"/>
+            <w:tcMar>
+              <w:top w:w="100" w:type="dxa"/>
+              <w:left w:w="120" w:type="dxa"/>
+              <w:bottom w:w="100" w:type="dxa"/>
+              <w:right w:w="120" w:type="dxa"/>
+            </w:tcMar>
+          </w:tcPr>
+          <w:p>
+            <w:r>
+              <w:rPr>
+                <w:b/>
+                <w:bCs/>
+                <w:color w:val="1F7A5C"/>
+                <w:sz w:val="20"/>
+                <w:szCs w:val="20"/>
+              </w:rPr>
+              <w:lastRenderedPageBreak/>
+              <w:t>Descripción</w:t>
+            </w:r>
+          </w:p>
+        </w:tc>
+        <w:tc>
+          <w:tcPr>
+            <w:tcW w:w="7740" w:type="dxa"/>
+            <w:tcMar>
+              <w:top w:w="100" w:type="dxa"/>
+              <w:left w:w="140" w:type="dxa"/>
+              <w:bottom w:w="100" w:type="dxa"/>
+              <w:right w:w="140" w:type="dxa"/>
+            </w:tcMar>
+          </w:tcPr>
+          <w:p>
+            <w:pPr>
+              <w:spacing w:line="280" w:lineRule="auto"/>
+              <w:jc w:val="both"/>
+            </w:pPr>
+            <w:r>
+              <w:t>Confirmado el cobro y generado el caso de instalación, Atención al Cliente envía al cliente el mensaje de bienvenida. En él confirma el alta, explica los próximos pasos (Instalaciones lo contactará para coordinar la fecha de la instalación) e informa los canales de contacto según el tipo de consulta.</w:t>
+            </w:r>
+          </w:p>
+        </w:tc>
+      </w:tr>
+      <w:tr>
+        <w:tc>
+          <w:tcPr>
+            <w:tcW w:w="2100" w:type="dxa"/>
+            <w:shd w:val="clear" w:color="auto" w:fill="DCEEE6"/>
+            <w:tcMar>
+              <w:top w:w="100" w:type="dxa"/>
+              <w:left w:w="120" w:type="dxa"/>
+              <w:bottom w:w="100" w:type="dxa"/>
+              <w:right w:w="120" w:type="dxa"/>
+            </w:tcMar>
+          </w:tcPr>
+          <w:p>
+            <w:r>
+              <w:rPr>
+                <w:b/>
+                <w:bCs/>
+                <w:color w:val="1F7A5C"/>
+                <w:sz w:val="20"/>
+                <w:szCs w:val="20"/>
+              </w:rPr>
+              <w:t>Responsabilidades del área</w:t>
+            </w:r>
+          </w:p>
+        </w:tc>
+        <w:tc>
+          <w:tcPr>
+            <w:tcW w:w="7740" w:type="dxa"/>
+            <w:tcMar>
+              <w:top w:w="100" w:type="dxa"/>
+              <w:left w:w="140" w:type="dxa"/>
+              <w:bottom w:w="100" w:type="dxa"/>
+              <w:right w:w="140" w:type="dxa"/>
+            </w:tcMar>
+          </w:tcPr>
+          <w:p>
+            <w:pPr>
+              <w:pStyle w:val="Prrafodelista"/>
+              <w:numPr>
+                <w:ilvl w:val="0"/>
+                <w:numId w:val="2"/>
+              </w:numPr>
+              <w:spacing w:after="60"/>
+            </w:pPr>
+            <w:r>
+              <w:rPr>
+                <w:color w:val="262626"/>
+              </w:rPr>
+              <w:t>Enviar el mensaje de bienvenida una vez confirmado el pago y generado el caso de instalación.</w:t>
+            </w:r>
+          </w:p>
+          <w:p>
+            <w:pPr>
+              <w:pStyle w:val="Prrafodelista"/>
+              <w:numPr>
+                <w:ilvl w:val="0"/>
+                <w:numId w:val="2"/>
+              </w:numPr>
+              <w:spacing w:after="60"/>
+            </w:pPr>
+            <w:r>
+              <w:rPr>
+                <w:color w:val="262626"/>
+              </w:rPr>
+              <w:t>Informar los próximos pasos: Instalaciones se contactará para coordinar día y horario de la instalación.</w:t>
+            </w:r>
+          </w:p>
+          <w:p>
+            <w:pPr>
+              <w:pStyle w:val="Prrafodelista"/>
+              <w:numPr>
+                <w:ilvl w:val="0"/>
+                <w:numId w:val="2"/>
+              </w:numPr>
+              <w:spacing w:after="60"/>
+            </w:pPr>
+            <w:r>
+              <w:rPr>
+                <w:color w:val="262626"/>
+              </w:rPr>
+              <w:t>Informar los canales de contacto según el tipo de consulta (administrativa, técnica o comercial).</w:t>
+            </w:r>
+          </w:p>
+          <w:p>
+            <w:pPr>
+              <w:pStyle w:val="Prrafodelista"/>
+              <w:numPr>
+                <w:ilvl w:val="0"/>
+                <w:numId w:val="2"/>
+              </w:numPr>
+              <w:spacing w:after="60"/>
+            </w:pPr>
+            <w:r>
+              <w:rPr>
+                <w:color w:val="262626"/>
+              </w:rPr>
+              <w:t>Registrar el envío de la bienvenida en el sistema.</w:t>
+            </w:r>
+          </w:p>
+        </w:tc>
+      </w:tr>
+      <w:tr>
+        <w:tc>
+          <w:tcPr>
+            <w:tcW w:w="2100" w:type="dxa"/>
+            <w:shd w:val="clear" w:color="auto" w:fill="DCEEE6"/>
+            <w:tcMar>
+              <w:top w:w="100" w:type="dxa"/>
+              <w:left w:w="120" w:type="dxa"/>
+              <w:bottom w:w="100" w:type="dxa"/>
+              <w:right w:w="120" w:type="dxa"/>
+            </w:tcMar>
+          </w:tcPr>
+          <w:p>
+            <w:r>
+              <w:rPr>
+                <w:b/>
+                <w:bCs/>
+                <w:color w:val="1F7A5C"/>
+                <w:sz w:val="20"/>
+                <w:szCs w:val="20"/>
+              </w:rPr>
+              <w:t>Entregable</w:t>
+            </w:r>
+          </w:p>
+        </w:tc>
+        <w:tc>
+          <w:tcPr>
+            <w:tcW w:w="7740" w:type="dxa"/>
+            <w:tcMar>
+              <w:top w:w="100" w:type="dxa"/>
+              <w:left w:w="140" w:type="dxa"/>
+              <w:bottom w:w="100" w:type="dxa"/>
+              <w:right w:w="140" w:type="dxa"/>
+            </w:tcMar>
+          </w:tcPr>
+          <w:p>
+            <w:pPr>
+              <w:spacing w:line="280" w:lineRule="auto"/>
+              <w:jc w:val="both"/>
+            </w:pPr>
+            <w:r>
+              <w:t>Cliente informado de los próximos pasos y de sus canales de contacto; bienvenida registrada.</w:t>
+            </w:r>
+          </w:p>
+        </w:tc>
+      </w:tr>
+      <w:tr>
+        <w:tc>
+          <w:tcPr>
+            <w:tcW w:w="2100" w:type="dxa"/>
+            <w:shd w:val="clear" w:color="auto" w:fill="DCEEE6"/>
+            <w:tcMar>
+              <w:top w:w="100" w:type="dxa"/>
+              <w:left w:w="120" w:type="dxa"/>
+              <w:bottom w:w="100" w:type="dxa"/>
+              <w:right w:w="120" w:type="dxa"/>
+            </w:tcMar>
+          </w:tcPr>
+          <w:p>
+            <w:r>
+              <w:rPr>
+                <w:b/>
+                <w:bCs/>
+                <w:color w:val="1F7A5C"/>
+                <w:sz w:val="20"/>
+                <w:szCs w:val="20"/>
+              </w:rPr>
+              <w:t>Pasa a</w:t>
+            </w:r>
+          </w:p>
+        </w:tc>
+        <w:tc>
+          <w:tcPr>
+            <w:tcW w:w="7740" w:type="dxa"/>
+            <w:tcMar>
+              <w:top w:w="100" w:type="dxa"/>
+              <w:left w:w="140" w:type="dxa"/>
+              <w:bottom w:w="100" w:type="dxa"/>
+              <w:right w:w="140" w:type="dxa"/>
+            </w:tcMar>
+          </w:tcPr>
+          <w:p>
+            <w:pPr>
+              <w:spacing w:line="280" w:lineRule="auto"/>
+              <w:jc w:val="both"/>
+            </w:pPr>
+            <w:r>
+              <w:t>Etapa 9 — Coordinación de la instalación.</w:t>
             </w:r>
           </w:p>
         </w:tc>
@@ -3804,7 +4173,7 @@
           <w:sz w:val="25"/>
           <w:szCs w:val="25"/>
         </w:rPr>
-        <w:t xml:space="preserve">Etapa 8. </w:t>
+        <w:t xml:space="preserve">Etapa 9. </w:t>
       </w:r>
       <w:r>
         <w:rPr>
@@ -4142,7 +4511,7 @@
               <w:jc w:val="both"/>
             </w:pPr>
             <w:r>
-              <w:t>Etapa 9 — Ejecución de la instalación.</w:t>
+              <w:t>Etapa 10 — Ejecución de la instalación.</w:t>
             </w:r>
           </w:p>
         </w:tc>
@@ -4164,7 +4533,7 @@
           <w:sz w:val="25"/>
           <w:szCs w:val="25"/>
         </w:rPr>
-        <w:t xml:space="preserve">Etapa 9. </w:t>
+        <w:t xml:space="preserve">Etapa 10. </w:t>
       </w:r>
       <w:r>
         <w:rPr>
@@ -4511,7 +4880,7 @@
               <w:jc w:val="both"/>
             </w:pPr>
             <w:r>
-              <w:t>Etapa 10 — Bienvenida y seguimiento postventa inicial.</w:t>
+              <w:t>Control de calidad posterior a la instalación (Posventa) y luego Etapa 11 — Mantenimiento preventivo.</w:t>
             </w:r>
           </w:p>
         </w:tc>
@@ -4533,7 +4902,6 @@
           <w:sz w:val="25"/>
           <w:szCs w:val="25"/>
         </w:rPr>
-        <w:t xml:space="preserve">Etapa 10. </w:t>
       </w:r>
       <w:r>
         <w:rPr>
@@ -4543,7 +4911,7 @@
           <w:sz w:val="25"/>
           <w:szCs w:val="25"/>
         </w:rPr>
-        <w:t>Bienvenida y seguimiento postventa inicial</w:t>
+        <w:t>Control de calidad posterior a la instalación</w:t>
       </w:r>
       <w:r>
         <w:rPr>
@@ -4553,7 +4921,6 @@
           <w:sz w:val="18"/>
           <w:szCs w:val="18"/>
         </w:rPr>
-        <w:t xml:space="preserve">  </w:t>
       </w:r>
     </w:p>
     <w:p>
@@ -4576,7 +4943,7 @@
           <w:sz w:val="19"/>
           <w:szCs w:val="19"/>
         </w:rPr>
-        <w:t>POSTVENTA</w:t>
+        <w:t>POSVENTA</w:t>
       </w:r>
     </w:p>
     <w:tbl>
@@ -4688,7 +5055,7 @@
               <w:jc w:val="both"/>
             </w:pPr>
             <w:r>
-              <w:t>Postventa</w:t>
+              <w:t>Posventa</w:t>
             </w:r>
             <w:r>
               <w:t xml:space="preserve"> contacta proactivamente al cliente luego de la instalación para validar que el sistema funciona correctamente, que no quedaron dudas de uso y que la experiencia general fue satisfactoria.</w:t>
@@ -4792,7 +5159,7 @@
               <w:rPr>
                 <w:color w:val="262626"/>
               </w:rPr>
-              <w:t>Registrar el resultado del contacto de bienvenida en el sistema (satisfacción inicial).</w:t>
+              <w:t>Registrar el resultado del contacto de seguimiento en el sistema (satisfacción inicial).</w:t>
             </w:r>
           </w:p>
         </w:tc>
@@ -5993,7 +6360,7 @@
               <w:jc w:val="both"/>
             </w:pPr>
             <w:r>
-              <w:t>Retorna a Etapa 8/9 (coordinación y ejecución) para la instalación de lo ampliado.</w:t>
+              <w:t>Retorna a Etapa 9/10 (coordinación y ejecución) para la instalación de lo ampliado.</w:t>
             </w:r>
           </w:p>
         </w:tc>

</xml_diff>

<commit_message>
Modificaciones proceso nuevos cliente
</commit_message>
<xml_diff>
--- a/assets/procesos/nuevos-clientes-instalacion/proceso-venta-atencion-por-areas.docx
+++ b/assets/procesos/nuevos-clientes-instalacion/proceso-venta-atencion-por-areas.docx
@@ -960,7 +960,7 @@
                 <w:sz w:val="19"/>
                 <w:szCs w:val="19"/>
               </w:rPr>
-              <w:t>Mantenimiento preventivo</w:t>
+              <w:t>Control de calidad posterior a la instalación</w:t>
             </w:r>
           </w:p>
         </w:tc>
@@ -980,11 +980,11 @@
               <w:rPr>
                 <w:b/>
                 <w:bCs/>
-                <w:color w:val="6A3FA0"/>
+                <w:color w:val="B7791F"/>
                 <w:sz w:val="19"/>
                 <w:szCs w:val="19"/>
               </w:rPr>
-              <w:t>SERVICIO TÉCNICO</w:t>
+              <w:t>POSVENTA</w:t>
             </w:r>
           </w:p>
         </w:tc>
@@ -993,7 +993,7 @@
         <w:tc>
           <w:tcPr>
             <w:tcW w:w="0" w:type="auto"/>
-            <w:shd w:val="clear" w:color="auto" w:fill="F2F2F2"/>
+            <w:shd w:val="clear" w:color="auto" w:fill="FFFFFF"/>
             <w:tcMar>
               <w:top w:w="70" w:type="dxa"/>
               <w:left w:w="100" w:type="dxa"/>
@@ -1017,7 +1017,7 @@
         <w:tc>
           <w:tcPr>
             <w:tcW w:w="0" w:type="auto"/>
-            <w:shd w:val="clear" w:color="auto" w:fill="F2F2F2"/>
+            <w:shd w:val="clear" w:color="auto" w:fill="FFFFFF"/>
             <w:tcMar>
               <w:top w:w="70" w:type="dxa"/>
               <w:left w:w="100" w:type="dxa"/>
@@ -1032,14 +1032,14 @@
                 <w:sz w:val="19"/>
                 <w:szCs w:val="19"/>
               </w:rPr>
-              <w:t>Mantenimiento correctivo y reclamos</w:t>
+              <w:t>Mantenimiento preventivo</w:t>
             </w:r>
           </w:p>
         </w:tc>
         <w:tc>
           <w:tcPr>
             <w:tcW w:w="0" w:type="auto"/>
-            <w:shd w:val="clear" w:color="auto" w:fill="F2F2F2"/>
+            <w:shd w:val="clear" w:color="auto" w:fill="FFFFFF"/>
             <w:tcMar>
               <w:top w:w="70" w:type="dxa"/>
               <w:left w:w="100" w:type="dxa"/>
@@ -1065,7 +1065,7 @@
         <w:tc>
           <w:tcPr>
             <w:tcW w:w="0" w:type="auto"/>
-            <w:shd w:val="clear" w:color="auto" w:fill="FFFFFF"/>
+            <w:shd w:val="clear" w:color="auto" w:fill="F2F2F2"/>
             <w:tcMar>
               <w:top w:w="70" w:type="dxa"/>
               <w:left w:w="100" w:type="dxa"/>
@@ -1089,7 +1089,7 @@
         <w:tc>
           <w:tcPr>
             <w:tcW w:w="0" w:type="auto"/>
-            <w:shd w:val="clear" w:color="auto" w:fill="FFFFFF"/>
+            <w:shd w:val="clear" w:color="auto" w:fill="F2F2F2"/>
             <w:tcMar>
               <w:top w:w="70" w:type="dxa"/>
               <w:left w:w="100" w:type="dxa"/>
@@ -1104,14 +1104,14 @@
                 <w:sz w:val="19"/>
                 <w:szCs w:val="19"/>
               </w:rPr>
-              <w:t>Gestión de nuevas necesidades</w:t>
+              <w:t>Mantenimiento correctivo y reclamos</w:t>
             </w:r>
           </w:p>
         </w:tc>
         <w:tc>
           <w:tcPr>
             <w:tcW w:w="0" w:type="auto"/>
-            <w:shd w:val="clear" w:color="auto" w:fill="FFFFFF"/>
+            <w:shd w:val="clear" w:color="auto" w:fill="F2F2F2"/>
             <w:tcMar>
               <w:top w:w="70" w:type="dxa"/>
               <w:left w:w="100" w:type="dxa"/>
@@ -1124,11 +1124,11 @@
               <w:rPr>
                 <w:b/>
                 <w:bCs/>
-                <w:color w:val="B03A2E"/>
+                <w:color w:val="6A3FA0"/>
                 <w:sz w:val="19"/>
                 <w:szCs w:val="19"/>
               </w:rPr>
-              <w:t>AMPLIACIONES</w:t>
+              <w:t>SERVICIO TÉCNICO</w:t>
             </w:r>
           </w:p>
         </w:tc>
@@ -1137,7 +1137,7 @@
         <w:tc>
           <w:tcPr>
             <w:tcW w:w="0" w:type="auto"/>
-            <w:shd w:val="clear" w:color="auto" w:fill="F2F2F2"/>
+            <w:shd w:val="clear" w:color="auto" w:fill="FFFFFF"/>
             <w:tcMar>
               <w:top w:w="70" w:type="dxa"/>
               <w:left w:w="100" w:type="dxa"/>
@@ -1161,7 +1161,7 @@
         <w:tc>
           <w:tcPr>
             <w:tcW w:w="0" w:type="auto"/>
-            <w:shd w:val="clear" w:color="auto" w:fill="F2F2F2"/>
+            <w:shd w:val="clear" w:color="auto" w:fill="FFFFFF"/>
             <w:tcMar>
               <w:top w:w="70" w:type="dxa"/>
               <w:left w:w="100" w:type="dxa"/>
@@ -1176,14 +1176,14 @@
                 <w:sz w:val="19"/>
                 <w:szCs w:val="19"/>
               </w:rPr>
-              <w:t>Cobranza recurrente y gestión de mora</w:t>
+              <w:t>Gestión de nuevas necesidades</w:t>
             </w:r>
           </w:p>
         </w:tc>
         <w:tc>
           <w:tcPr>
             <w:tcW w:w="0" w:type="auto"/>
-            <w:shd w:val="clear" w:color="auto" w:fill="F2F2F2"/>
+            <w:shd w:val="clear" w:color="auto" w:fill="FFFFFF"/>
             <w:tcMar>
               <w:top w:w="70" w:type="dxa"/>
               <w:left w:w="100" w:type="dxa"/>
@@ -1196,11 +1196,11 @@
               <w:rPr>
                 <w:b/>
                 <w:bCs/>
-                <w:color w:val="1F7A5C"/>
+                <w:color w:val="B03A2E"/>
                 <w:sz w:val="19"/>
                 <w:szCs w:val="19"/>
               </w:rPr>
-              <w:t>ATENCIÓN AL CLIENTE</w:t>
+              <w:t>AMPLIACIONES</w:t>
             </w:r>
           </w:p>
         </w:tc>
@@ -1209,7 +1209,7 @@
         <w:tc>
           <w:tcPr>
             <w:tcW w:w="0" w:type="auto"/>
-            <w:shd w:val="clear" w:color="auto" w:fill="FFFFFF"/>
+            <w:shd w:val="clear" w:color="auto" w:fill="F2F2F2"/>
             <w:tcMar>
               <w:top w:w="70" w:type="dxa"/>
               <w:left w:w="100" w:type="dxa"/>
@@ -1227,6 +1227,78 @@
                 <w:szCs w:val="19"/>
               </w:rPr>
               <w:t>15</w:t>
+            </w:r>
+          </w:p>
+        </w:tc>
+        <w:tc>
+          <w:tcPr>
+            <w:tcW w:w="0" w:type="auto"/>
+            <w:shd w:val="clear" w:color="auto" w:fill="F2F2F2"/>
+            <w:tcMar>
+              <w:top w:w="70" w:type="dxa"/>
+              <w:left w:w="100" w:type="dxa"/>
+              <w:bottom w:w="70" w:type="dxa"/>
+              <w:right w:w="100" w:type="dxa"/>
+            </w:tcMar>
+          </w:tcPr>
+          <w:p>
+            <w:r>
+              <w:rPr>
+                <w:color w:val="262626"/>
+                <w:sz w:val="19"/>
+                <w:szCs w:val="19"/>
+              </w:rPr>
+              <w:t>Cobranza recurrente y gestión de mora</w:t>
+            </w:r>
+          </w:p>
+        </w:tc>
+        <w:tc>
+          <w:tcPr>
+            <w:tcW w:w="0" w:type="auto"/>
+            <w:shd w:val="clear" w:color="auto" w:fill="F2F2F2"/>
+            <w:tcMar>
+              <w:top w:w="70" w:type="dxa"/>
+              <w:left w:w="100" w:type="dxa"/>
+              <w:bottom w:w="70" w:type="dxa"/>
+              <w:right w:w="100" w:type="dxa"/>
+            </w:tcMar>
+          </w:tcPr>
+          <w:p>
+            <w:r>
+              <w:rPr>
+                <w:b/>
+                <w:bCs/>
+                <w:color w:val="1F7A5C"/>
+                <w:sz w:val="19"/>
+                <w:szCs w:val="19"/>
+              </w:rPr>
+              <w:t>ATENCIÓN AL CLIENTE</w:t>
+            </w:r>
+          </w:p>
+        </w:tc>
+      </w:tr>
+      <w:tr>
+        <w:tc>
+          <w:tcPr>
+            <w:tcW w:w="0" w:type="auto"/>
+            <w:shd w:val="clear" w:color="auto" w:fill="FFFFFF"/>
+            <w:tcMar>
+              <w:top w:w="70" w:type="dxa"/>
+              <w:left w:w="100" w:type="dxa"/>
+              <w:bottom w:w="70" w:type="dxa"/>
+              <w:right w:w="100" w:type="dxa"/>
+            </w:tcMar>
+          </w:tcPr>
+          <w:p>
+            <w:r>
+              <w:rPr>
+                <w:b/>
+                <w:bCs/>
+                <w:color w:val="262626"/>
+                <w:sz w:val="19"/>
+                <w:szCs w:val="19"/>
+              </w:rPr>
+              <w:t>16</w:t>
             </w:r>
           </w:p>
         </w:tc>
@@ -4880,7 +4952,7 @@
               <w:jc w:val="both"/>
             </w:pPr>
             <w:r>
-              <w:t>Control de calidad posterior a la instalación (Posventa) y luego Etapa 11 — Mantenimiento preventivo.</w:t>
+              <w:t>Etapa 11 — Control de calidad posterior a la instalación.</w:t>
             </w:r>
           </w:p>
         </w:tc>
@@ -4902,6 +4974,7 @@
           <w:sz w:val="25"/>
           <w:szCs w:val="25"/>
         </w:rPr>
+        <w:t xml:space="preserve">Etapa 11. </w:t>
       </w:r>
       <w:r>
         <w:rPr>
@@ -5251,7 +5324,7 @@
               <w:jc w:val="both"/>
             </w:pPr>
             <w:r>
-              <w:t>Etapa 11 — Mantenimiento preventivo (a partir de aquí, ciclo continuo de servicio).</w:t>
+              <w:t>Etapa 12 — Mantenimiento preventivo (a partir de aquí, ciclo continuo de servicio).</w:t>
             </w:r>
           </w:p>
         </w:tc>
@@ -5273,7 +5346,7 @@
           <w:sz w:val="25"/>
           <w:szCs w:val="25"/>
         </w:rPr>
-        <w:t xml:space="preserve">Etapa 11. </w:t>
+        <w:t xml:space="preserve">Etapa 12. </w:t>
       </w:r>
       <w:r>
         <w:rPr>
@@ -5620,7 +5693,7 @@
               <w:jc w:val="both"/>
             </w:pPr>
             <w:r>
-              <w:t>Continúa el ciclo (próximo mantenimiento programado) o deriva a Etapa 12 si se detecta una falla.</w:t>
+              <w:t>Continúa el ciclo (próximo mantenimiento programado) o deriva a Etapa 13 si se detecta una falla.</w:t>
             </w:r>
           </w:p>
         </w:tc>
@@ -5642,7 +5715,7 @@
           <w:sz w:val="25"/>
           <w:szCs w:val="25"/>
         </w:rPr>
-        <w:t xml:space="preserve">Etapa 12. </w:t>
+        <w:t xml:space="preserve">Etapa 13. </w:t>
       </w:r>
       <w:r>
         <w:rPr>
@@ -5991,7 +6064,7 @@
               <w:jc w:val="both"/>
             </w:pPr>
             <w:r>
-              <w:t>Regresa al ciclo de mantenimiento preventivo (Etapa 11).</w:t>
+              <w:t>Regresa al ciclo de mantenimiento preventivo (Etapa 12).</w:t>
             </w:r>
           </w:p>
         </w:tc>
@@ -6013,7 +6086,7 @@
           <w:sz w:val="25"/>
           <w:szCs w:val="25"/>
         </w:rPr>
-        <w:t xml:space="preserve">Etapa 13. </w:t>
+        <w:t xml:space="preserve">Etapa 14. </w:t>
       </w:r>
       <w:r>
         <w:rPr>
@@ -6382,7 +6455,7 @@
           <w:sz w:val="25"/>
           <w:szCs w:val="25"/>
         </w:rPr>
-        <w:t xml:space="preserve">Etapa 14. </w:t>
+        <w:t xml:space="preserve">Etapa 15. </w:t>
       </w:r>
       <w:r>
         <w:rPr>
@@ -6730,7 +6803,7 @@
               <w:jc w:val="both"/>
             </w:pPr>
             <w:r>
-              <w:t>Ciclo mensual continuo; casos sin resolver derivan a Etapa 15.</w:t>
+              <w:t>Ciclo mensual continuo; casos sin resolver derivan a Etapa 16.</w:t>
             </w:r>
           </w:p>
         </w:tc>
@@ -6752,7 +6825,7 @@
           <w:sz w:val="25"/>
           <w:szCs w:val="25"/>
         </w:rPr>
-        <w:t xml:space="preserve">Etapa 15. </w:t>
+        <w:t xml:space="preserve">Etapa 16. </w:t>
       </w:r>
       <w:r>
         <w:rPr>
@@ -6959,7 +7032,7 @@
               <w:rPr>
                 <w:color w:val="262626"/>
               </w:rPr>
-              <w:t>Recibir y registrar el pedido de baja o escalar los casos de mora prolongada desde la Etapa 14.</w:t>
+              <w:t>Recibir y registrar el pedido de baja o escalar los casos de mora prolongada desde la Etapa 15.</w:t>
             </w:r>
           </w:p>
           <w:p>

</xml_diff>